<commit_message>
Revamp UI styles and add reference library
Overhauled the Observer View HTML (file 203367): new design tokens, typography (Google fonts + IBM Plex), color palette, favicon/project mark, and many CSS/layout refinements for cards, panels, lists and responsive/mobile rules. Added accessibility focus styling and improved header/footer/ui copy. Introduced a Reference Library section with downloadable ChatGPT and Claude forecast artifacts and visual assets. Updated the Claude Forecast .docx binary and added a .DS_Store file (OS metadata).
</commit_message>
<xml_diff>
--- a/Claude Forecast - Columbus_Micromobility_Event_Demand_Sources_branded.docx
+++ b/Claude Forecast - Columbus_Micromobility_Event_Demand_Sources_branded.docx
@@ -2448,6 +2448,512 @@
           <w:szCs w:val="21"/>
         </w:rPr>
         <w:t xml:space="preserve">Overlapping events within roughly one mile</w:t>
+      </w:r>
+    </w:p>
+    <w:p>
+      <w:pPr>
+        <w:pStyle w:val="Heading1"/>
+        <w:pBdr>
+          <w:bottom w:val="single" w:color="DAD5C9" w:sz="4" w:space="8"/>
+        </w:pBdr>
+        <w:spacing w:after="200" w:before="520"/>
+      </w:pPr>
+      <w:r>
+        <w:rPr>
+          <w:rFonts w:ascii="Fraunces" w:cs="Fraunces" w:eastAsia="Fraunces" w:hAnsi="Fraunces"/>
+          <w:b w:val="false"/>
+          <w:bCs w:val="false"/>
+          <w:color w:val="14171C"/>
+          <w:sz w:val="30"/>
+          <w:szCs w:val="30"/>
+        </w:rPr>
+        <w:t xml:space="preserve">Companion database</w:t>
+      </w:r>
+    </w:p>
+    <w:p>
+      <w:pPr>
+        <w:spacing w:after="220"/>
+      </w:pPr>
+      <w:r>
+        <w:rPr>
+          <w:rFonts w:ascii="Inter" w:cs="Inter" w:eastAsia="Inter" w:hAnsi="Inter"/>
+          <w:color w:val="14171C"/>
+          <w:sz w:val="22"/>
+          <w:szCs w:val="22"/>
+        </w:rPr>
+        <w:t xml:space="preserve">This guide is now backed by a live workbook — Columbus_Micromobility_Events_Historical_2024-2026.xlsx — that operationalizes the minimum event record above into a queryable history plus a forward-looking projection, all keyed to ISO year and week so demand can be compared week-over-week and year-over-year.</w:t>
+      </w:r>
+    </w:p>
+    <w:p>
+      <w:pPr>
+        <w:spacing w:after="140" w:before="40"/>
+      </w:pPr>
+      <w:r>
+        <w:rPr>
+          <w:rFonts w:ascii="JetBrains Mono" w:cs="JetBrains Mono" w:eastAsia="JetBrains Mono" w:hAnsi="JetBrains Mono"/>
+          <w:b/>
+          <w:bCs/>
+          <w:color w:val="1F6B63"/>
+          <w:spacing w:val="24"/>
+          <w:sz w:val="15"/>
+          <w:szCs w:val="15"/>
+        </w:rPr>
+        <w:t xml:space="preserve">WORKBOOK CONTENTS</w:t>
+      </w:r>
+    </w:p>
+    <w:tbl>
+      <w:tblPr>
+        <w:tblW w:type="dxa" w:w="9160"/>
+        <w:tblBorders>
+          <w:top w:val="single" w:color="DAD5C9" w:sz="2"/>
+          <w:left w:val="single" w:color="DAD5C9" w:sz="2"/>
+          <w:bottom w:val="single" w:color="DAD5C9" w:sz="2"/>
+          <w:right w:val="single" w:color="DAD5C9" w:sz="2"/>
+          <w:insideH w:val="single" w:color="auto" w:sz="4"/>
+          <w:insideV w:val="single" w:color="auto" w:sz="4"/>
+        </w:tblBorders>
+      </w:tblPr>
+      <w:tblGrid>
+        <w:gridCol w:w="2200"/>
+        <w:gridCol w:w="6960"/>
+      </w:tblGrid>
+      <w:tr>
+        <w:trPr>
+          <w:tblHeader/>
+        </w:trPr>
+        <w:tc>
+          <w:tcPr>
+            <w:tcW w:type="dxa" w:w="2200"/>
+            <w:shd w:fill="4FD1C5" w:color="auto" w:val="clear"/>
+            <w:tcMar>
+              <w:top w:type="dxa" w:w="100"/>
+              <w:left w:type="dxa" w:w="140"/>
+              <w:bottom w:type="dxa" w:w="100"/>
+              <w:right w:type="dxa" w:w="140"/>
+            </w:tcMar>
+            <w:vAlign w:val="center"/>
+          </w:tcPr>
+          <w:p>
+            <w:pPr>
+              <w:jc w:val="left"/>
+            </w:pPr>
+            <w:r>
+              <w:rPr>
+                <w:rFonts w:ascii="JetBrains Mono" w:cs="JetBrains Mono" w:eastAsia="JetBrains Mono" w:hAnsi="JetBrains Mono"/>
+                <w:b/>
+                <w:bCs/>
+                <w:color w:val="14171C"/>
+                <w:spacing w:val="12"/>
+                <w:sz w:val="16"/>
+                <w:szCs w:val="16"/>
+              </w:rPr>
+              <w:t xml:space="preserve">Tab</w:t>
+            </w:r>
+          </w:p>
+        </w:tc>
+        <w:tc>
+          <w:tcPr>
+            <w:tcW w:type="dxa" w:w="6960"/>
+            <w:shd w:fill="4FD1C5" w:color="auto" w:val="clear"/>
+            <w:tcMar>
+              <w:top w:type="dxa" w:w="100"/>
+              <w:left w:type="dxa" w:w="140"/>
+              <w:bottom w:type="dxa" w:w="100"/>
+              <w:right w:type="dxa" w:w="140"/>
+            </w:tcMar>
+            <w:vAlign w:val="center"/>
+          </w:tcPr>
+          <w:p>
+            <w:pPr>
+              <w:jc w:val="left"/>
+            </w:pPr>
+            <w:r>
+              <w:rPr>
+                <w:rFonts w:ascii="JetBrains Mono" w:cs="JetBrains Mono" w:eastAsia="JetBrains Mono" w:hAnsi="JetBrains Mono"/>
+                <w:b/>
+                <w:bCs/>
+                <w:color w:val="14171C"/>
+                <w:spacing w:val="12"/>
+                <w:sz w:val="16"/>
+                <w:szCs w:val="16"/>
+              </w:rPr>
+              <w:t xml:space="preserve">Contents</w:t>
+            </w:r>
+          </w:p>
+        </w:tc>
+      </w:tr>
+      <w:tr>
+        <w:tc>
+          <w:tcPr>
+            <w:tcW w:type="dxa" w:w="2200"/>
+            <w:tcMar>
+              <w:top w:type="dxa" w:w="100"/>
+              <w:left w:type="dxa" w:w="140"/>
+              <w:bottom w:type="dxa" w:w="100"/>
+              <w:right w:type="dxa" w:w="140"/>
+            </w:tcMar>
+            <w:vAlign w:val="center"/>
+          </w:tcPr>
+          <w:p>
+            <w:pPr>
+              <w:jc w:val="left"/>
+            </w:pPr>
+            <w:r>
+              <w:rPr>
+                <w:rFonts w:ascii="Inter" w:cs="Inter" w:eastAsia="Inter" w:hAnsi="Inter"/>
+                <w:b w:val="false"/>
+                <w:bCs w:val="false"/>
+                <w:color w:val="14171C"/>
+                <w:sz w:val="19"/>
+                <w:szCs w:val="19"/>
+              </w:rPr>
+              <w:t xml:space="preserve">Events</w:t>
+            </w:r>
+          </w:p>
+        </w:tc>
+        <w:tc>
+          <w:tcPr>
+            <w:tcW w:type="dxa" w:w="6960"/>
+            <w:tcMar>
+              <w:top w:type="dxa" w:w="100"/>
+              <w:left w:type="dxa" w:w="140"/>
+              <w:bottom w:type="dxa" w:w="100"/>
+              <w:right w:type="dxa" w:w="140"/>
+            </w:tcMar>
+            <w:vAlign w:val="center"/>
+          </w:tcPr>
+          <w:p>
+            <w:pPr>
+              <w:jc w:val="left"/>
+            </w:pPr>
+            <w:r>
+              <w:rPr>
+                <w:rFonts w:ascii="Inter" w:cs="Inter" w:eastAsia="Inter" w:hAnsi="Inter"/>
+                <w:b w:val="false"/>
+                <w:bCs w:val="false"/>
+                <w:color w:val="14171C"/>
+                <w:sz w:val="19"/>
+                <w:szCs w:val="19"/>
+              </w:rPr>
+              <w:t xml:space="preserve">251 dated records, 2024-2026 to date: OSU football, Blue Jackets, Crew, and Clippers home schedules; Arnold Sports Festival, Comfest, Red White &amp; BOOM, Doo Dah, Ohio State Fair, the Marathon, Origins/GalaxyCon, and major arena concerts. Each row carries ISO year, ISO week, venue, ops/sys track, attendance, and a Played/Scheduled/Estimated/Projected/Unconfirmed status.</w:t>
+            </w:r>
+          </w:p>
+        </w:tc>
+      </w:tr>
+      <w:tr>
+        <w:tc>
+          <w:tcPr>
+            <w:tcW w:type="dxa" w:w="2200"/>
+            <w:shd w:fill="F6F3EC" w:color="auto" w:val="clear"/>
+            <w:tcMar>
+              <w:top w:type="dxa" w:w="100"/>
+              <w:left w:type="dxa" w:w="140"/>
+              <w:bottom w:type="dxa" w:w="100"/>
+              <w:right w:type="dxa" w:w="140"/>
+            </w:tcMar>
+            <w:vAlign w:val="center"/>
+          </w:tcPr>
+          <w:p>
+            <w:pPr>
+              <w:jc w:val="left"/>
+            </w:pPr>
+            <w:r>
+              <w:rPr>
+                <w:rFonts w:ascii="Inter" w:cs="Inter" w:eastAsia="Inter" w:hAnsi="Inter"/>
+                <w:b w:val="false"/>
+                <w:bCs w:val="false"/>
+                <w:color w:val="14171C"/>
+                <w:sz w:val="19"/>
+                <w:szCs w:val="19"/>
+              </w:rPr>
+              <w:t xml:space="preserve">Weekly Summary</w:t>
+            </w:r>
+          </w:p>
+        </w:tc>
+        <w:tc>
+          <w:tcPr>
+            <w:tcW w:type="dxa" w:w="6960"/>
+            <w:shd w:fill="F6F3EC" w:color="auto" w:val="clear"/>
+            <w:tcMar>
+              <w:top w:type="dxa" w:w="100"/>
+              <w:left w:type="dxa" w:w="140"/>
+              <w:bottom w:type="dxa" w:w="100"/>
+              <w:right w:type="dxa" w:w="140"/>
+            </w:tcMar>
+            <w:vAlign w:val="center"/>
+          </w:tcPr>
+          <w:p>
+            <w:pPr>
+              <w:jc w:val="left"/>
+            </w:pPr>
+            <w:r>
+              <w:rPr>
+                <w:rFonts w:ascii="Inter" w:cs="Inter" w:eastAsia="Inter" w:hAnsi="Inter"/>
+                <w:b w:val="false"/>
+                <w:bCs w:val="false"/>
+                <w:color w:val="14171C"/>
+                <w:sz w:val="19"/>
+                <w:szCs w:val="19"/>
+              </w:rPr>
+              <w:t xml:space="preserve">Event count and attendance per ISO week for 2024, 2025, and 2026, with live week-over-week and year-over-year delta formulas.</w:t>
+            </w:r>
+          </w:p>
+        </w:tc>
+      </w:tr>
+      <w:tr>
+        <w:tc>
+          <w:tcPr>
+            <w:tcW w:type="dxa" w:w="2200"/>
+            <w:tcMar>
+              <w:top w:type="dxa" w:w="100"/>
+              <w:left w:type="dxa" w:w="140"/>
+              <w:bottom w:type="dxa" w:w="100"/>
+              <w:right w:type="dxa" w:w="140"/>
+            </w:tcMar>
+            <w:vAlign w:val="center"/>
+          </w:tcPr>
+          <w:p>
+            <w:pPr>
+              <w:jc w:val="left"/>
+            </w:pPr>
+            <w:r>
+              <w:rPr>
+                <w:rFonts w:ascii="Inter" w:cs="Inter" w:eastAsia="Inter" w:hAnsi="Inter"/>
+                <w:b w:val="false"/>
+                <w:bCs w:val="false"/>
+                <w:color w:val="14171C"/>
+                <w:sz w:val="19"/>
+                <w:szCs w:val="19"/>
+              </w:rPr>
+              <w:t xml:space="preserve">2026 Projection</w:t>
+            </w:r>
+          </w:p>
+        </w:tc>
+        <w:tc>
+          <w:tcPr>
+            <w:tcW w:type="dxa" w:w="6960"/>
+            <w:tcMar>
+              <w:top w:type="dxa" w:w="100"/>
+              <w:left w:type="dxa" w:w="140"/>
+              <w:bottom w:type="dxa" w:w="100"/>
+              <w:right w:type="dxa" w:w="140"/>
+            </w:tcMar>
+            <w:vAlign w:val="center"/>
+          </w:tcPr>
+          <w:p>
+            <w:pPr>
+              <w:jc w:val="left"/>
+            </w:pPr>
+            <w:r>
+              <w:rPr>
+                <w:rFonts w:ascii="Inter" w:cs="Inter" w:eastAsia="Inter" w:hAnsi="Inter"/>
+                <w:b w:val="false"/>
+                <w:bCs w:val="false"/>
+                <w:color w:val="14171C"/>
+                <w:sz w:val="19"/>
+                <w:szCs w:val="19"/>
+              </w:rPr>
+              <w:t xml:space="preserve">For every ISO week remaining in 2026: a 2-year (2024/2025) baseline event count, what's already confirmed, and a projected gap-fill for likely unannounced demand.</w:t>
+            </w:r>
+          </w:p>
+        </w:tc>
+      </w:tr>
+      <w:tr>
+        <w:tc>
+          <w:tcPr>
+            <w:tcW w:type="dxa" w:w="2200"/>
+            <w:shd w:fill="F6F3EC" w:color="auto" w:val="clear"/>
+            <w:tcMar>
+              <w:top w:type="dxa" w:w="100"/>
+              <w:left w:type="dxa" w:w="140"/>
+              <w:bottom w:type="dxa" w:w="100"/>
+              <w:right w:type="dxa" w:w="140"/>
+            </w:tcMar>
+            <w:vAlign w:val="center"/>
+          </w:tcPr>
+          <w:p>
+            <w:pPr>
+              <w:jc w:val="left"/>
+            </w:pPr>
+            <w:r>
+              <w:rPr>
+                <w:rFonts w:ascii="Inter" w:cs="Inter" w:eastAsia="Inter" w:hAnsi="Inter"/>
+                <w:b w:val="false"/>
+                <w:bCs w:val="false"/>
+                <w:color w:val="14171C"/>
+                <w:sz w:val="19"/>
+                <w:szCs w:val="19"/>
+              </w:rPr>
+              <w:t xml:space="preserve">Weather (Historical)</w:t>
+            </w:r>
+          </w:p>
+        </w:tc>
+        <w:tc>
+          <w:tcPr>
+            <w:tcW w:type="dxa" w:w="6960"/>
+            <w:shd w:fill="F6F3EC" w:color="auto" w:val="clear"/>
+            <w:tcMar>
+              <w:top w:type="dxa" w:w="100"/>
+              <w:left w:type="dxa" w:w="140"/>
+              <w:bottom w:type="dxa" w:w="100"/>
+              <w:right w:type="dxa" w:w="140"/>
+            </w:tcMar>
+            <w:vAlign w:val="center"/>
+          </w:tcPr>
+          <w:p>
+            <w:pPr>
+              <w:jc w:val="left"/>
+            </w:pPr>
+            <w:r>
+              <w:rPr>
+                <w:rFonts w:ascii="Inter" w:cs="Inter" w:eastAsia="Inter" w:hAnsi="Inter"/>
+                <w:b w:val="false"/>
+                <w:bCs w:val="false"/>
+                <w:color w:val="14171C"/>
+                <w:sz w:val="19"/>
+                <w:szCs w:val="19"/>
+              </w:rPr>
+              <w:t xml:space="preserve">Weekly avg high/low, precipitation, snowfall, and a severe-weather-day flag for 2024 through the current week, from Open-Meteo's historical archive for the Columbus area.</w:t>
+            </w:r>
+          </w:p>
+        </w:tc>
+      </w:tr>
+      <w:tr>
+        <w:tc>
+          <w:tcPr>
+            <w:tcW w:type="dxa" w:w="2200"/>
+            <w:tcMar>
+              <w:top w:type="dxa" w:w="100"/>
+              <w:left w:type="dxa" w:w="140"/>
+              <w:bottom w:type="dxa" w:w="100"/>
+              <w:right w:type="dxa" w:w="140"/>
+            </w:tcMar>
+            <w:vAlign w:val="center"/>
+          </w:tcPr>
+          <w:p>
+            <w:pPr>
+              <w:jc w:val="left"/>
+            </w:pPr>
+            <w:r>
+              <w:rPr>
+                <w:rFonts w:ascii="Inter" w:cs="Inter" w:eastAsia="Inter" w:hAnsi="Inter"/>
+                <w:b w:val="false"/>
+                <w:bCs w:val="false"/>
+                <w:color w:val="14171C"/>
+                <w:sz w:val="19"/>
+                <w:szCs w:val="19"/>
+              </w:rPr>
+              <w:t xml:space="preserve">2026 Weather Projection</w:t>
+            </w:r>
+          </w:p>
+        </w:tc>
+        <w:tc>
+          <w:tcPr>
+            <w:tcW w:type="dxa" w:w="6960"/>
+            <w:tcMar>
+              <w:top w:type="dxa" w:w="100"/>
+              <w:left w:type="dxa" w:w="140"/>
+              <w:bottom w:type="dxa" w:w="100"/>
+              <w:right w:type="dxa" w:w="140"/>
+            </w:tcMar>
+            <w:vAlign w:val="center"/>
+          </w:tcPr>
+          <w:p>
+            <w:pPr>
+              <w:jc w:val="left"/>
+            </w:pPr>
+            <w:r>
+              <w:rPr>
+                <w:rFonts w:ascii="Inter" w:cs="Inter" w:eastAsia="Inter" w:hAnsi="Inter"/>
+                <w:b w:val="false"/>
+                <w:bCs w:val="false"/>
+                <w:color w:val="14171C"/>
+                <w:sz w:val="19"/>
+                <w:szCs w:val="19"/>
+              </w:rPr>
+              <w:t xml:space="preserve">NOAA 1991-2020 climate normals for Port Columbus (KCMH) by ISO week, blended with 2024/2025 actuals, for every remaining week of 2026.</w:t>
+            </w:r>
+          </w:p>
+        </w:tc>
+      </w:tr>
+      <w:tr>
+        <w:tc>
+          <w:tcPr>
+            <w:tcW w:type="dxa" w:w="2200"/>
+            <w:shd w:fill="F6F3EC" w:color="auto" w:val="clear"/>
+            <w:tcMar>
+              <w:top w:type="dxa" w:w="100"/>
+              <w:left w:type="dxa" w:w="140"/>
+              <w:bottom w:type="dxa" w:w="100"/>
+              <w:right w:type="dxa" w:w="140"/>
+            </w:tcMar>
+            <w:vAlign w:val="center"/>
+          </w:tcPr>
+          <w:p>
+            <w:pPr>
+              <w:jc w:val="left"/>
+            </w:pPr>
+            <w:r>
+              <w:rPr>
+                <w:rFonts w:ascii="Inter" w:cs="Inter" w:eastAsia="Inter" w:hAnsi="Inter"/>
+                <w:b w:val="false"/>
+                <w:bCs w:val="false"/>
+                <w:color w:val="14171C"/>
+                <w:sz w:val="19"/>
+                <w:szCs w:val="19"/>
+              </w:rPr>
+              <w:t xml:space="preserve">Data Gaps &amp; Assumptions</w:t>
+            </w:r>
+          </w:p>
+        </w:tc>
+        <w:tc>
+          <w:tcPr>
+            <w:tcW w:type="dxa" w:w="6960"/>
+            <w:shd w:fill="F6F3EC" w:color="auto" w:val="clear"/>
+            <w:tcMar>
+              <w:top w:type="dxa" w:w="100"/>
+              <w:left w:type="dxa" w:w="140"/>
+              <w:bottom w:type="dxa" w:w="100"/>
+              <w:right w:type="dxa" w:w="140"/>
+            </w:tcMar>
+            <w:vAlign w:val="center"/>
+          </w:tcPr>
+          <w:p>
+            <w:pPr>
+              <w:jc w:val="left"/>
+            </w:pPr>
+            <w:r>
+              <w:rPr>
+                <w:rFonts w:ascii="Inter" w:cs="Inter" w:eastAsia="Inter" w:hAnsi="Inter"/>
+                <w:b w:val="false"/>
+                <w:bCs w:val="false"/>
+                <w:color w:val="14171C"/>
+                <w:sz w:val="19"/>
+                <w:szCs w:val="19"/>
+              </w:rPr>
+              <w:t xml:space="preserve">Every placeholder, estimate, and unconfirmed date in the workbook, with the reasoning and what to verify before relying on it.</w:t>
+            </w:r>
+          </w:p>
+        </w:tc>
+      </w:tr>
+    </w:tbl>
+    <w:p>
+      <w:pPr>
+        <w:spacing w:after="200"/>
+      </w:pPr>
+    </w:p>
+    <w:p>
+      <w:pPr>
+        <w:spacing w:after="220"/>
+      </w:pPr>
+      <w:r>
+        <w:rPr>
+          <w:rFonts w:ascii="Inter" w:cs="Inter" w:eastAsia="Inter" w:hAnsi="Inter"/>
+          <w:color w:val="14171C"/>
+          <w:sz w:val="22"/>
+          <w:szCs w:val="22"/>
+        </w:rPr>
+        <w:t xml:space="preserve">Use the workbook for the numbers — this guide stays the reference for where to find and verify them each week.</w:t>
       </w:r>
     </w:p>
     <w:p>

</xml_diff>